<commit_message>
Final manuscript draft: 29 verified references, updated AUC MAPE (45.9%), bootstrap validation
- Cleaned references from 43 to 29 verified entries, renumbered all in-text citations
- Corrected AUC MAPE from 10.9% to 45.9% throughout Discussion and Table 2
- Added bootstrap_validation.py: parametric Monte Carlo CI on MAPE, 1-cmt linear comparison
- Regenerated manuscript.docx and cover_letter.docx
</commit_message>
<xml_diff>
--- a/manuscript.docx
+++ b/manuscript.docx
@@ -175,7 +175,7 @@
         <w:pStyle w:val="FirstParagraph"/>
       </w:pPr>
       <w:r>
-        <w:t xml:space="preserve">Lisdexamfetamine dimesylate (LDX; Vyvanse, Elvanse) is a therapeutically inactive lysine-conjugated prodrug of d-amphetamine that is converted enzymatically following oral absorption [1]. The prodrug design confers a pharmacokinetic profile that is more gradual in onset and less susceptible to dose-dumping than immediate-release amphetamine formulations, properties that are clinically relevant for both therapeutic efficacy and abuse deterrence in attention deficit hyperactivity disorder (ADHD) [2, 4]. Following oral administration, LDX is absorbed intact from the gastrointestinal tract and cleaved by peptidases — primarily in the blood — to release d-amphetamine. The resulting d-AMP profile exhibits a prolonged apparent absorption phase, a broad concentration peak at approximately 3.5–4.5 hours post-dose, and a terminal elimination half-life of roughly 10–11 hours [1, 4].</w:t>
+        <w:t xml:space="preserve">Lisdexamfetamine dimesylate (LDX; Vyvanse, Elvanse) is a therapeutically inactive lysine-conjugated prodrug of d-amphetamine that is converted enzymatically following oral absorption [1]. The prodrug design confers a pharmacokinetic profile that is more gradual in onset and less susceptible to dose-dumping than immediate-release amphetamine formulations, properties that are clinically relevant for both therapeutic efficacy and abuse deterrence in attention deficit hyperactivity disorder (ADHD) [2, 4, 10]. ADHD affects an estimated 5–7% of children and 2–3% of adults globally [7], and LDX has demonstrated efficacy across age groups in randomised controlled trials. Its prodrug mechanism — enzymatic cleavage by erythrocyte peptidases — renders it pharmacologically inactive until absorbed, providing a rate-limiting conversion step that moderates peak plasma concentrations of the active moiety [9]. Following oral administration, LDX is absorbed intact from the gastrointestinal tract and cleaved by peptidases — primarily in the blood — to release d-amphetamine [9]. The resulting d-AMP profile exhibits a prolonged apparent absorption phase, a broad concentration peak at approximately 3.5–4.5 hours post-dose, and a terminal elimination half-life of roughly 10–11 hours [1, 4].</w:t>
       </w:r>
     </w:p>
     <w:p>
@@ -183,7 +183,7 @@
         <w:pStyle w:val="BodyText"/>
       </w:pPr>
       <w:r>
-        <w:t xml:space="preserve">Despite the clinical importance of LDX across the approved dose range (30–70 mg in children; up to 70 mg in adults for ADHD; 50–70 mg for binge eating disorder), quantitative mechanistic modelling of the prodrug conversion kinetics and their interaction with food-induced absorption changes has received limited open scientific attention. Published population pharmacokinetic analyses of LDX have generally been conducted on proprietary clinical trial datasets and reported as regulatory-directed summaries, limiting independent replication and prospective use for clinical simulation [5]. The empirical observation that food delays but does not reduce LDX absorption — increasing Tmax by approximately 0.9 hours while leaving Cmax and AUC unchanged — has been well characterised [1, 3], but the mechanistic basis for this delay (a reduction in the first-order gastric absorption rate constant ka) has not been formally incorporated into a publicly validated predictive model.</w:t>
+        <w:t xml:space="preserve">Despite the clinical importance of LDX across the approved dose range (30–70 mg in children; up to 70 mg in adults for ADHD; 50–70 mg for binge eating disorder), quantitative mechanistic modelling of the prodrug conversion kinetics and their interaction with food-induced absorption changes has received limited open scientific attention. Published population pharmacokinetic analyses of LDX have generally been conducted on proprietary clinical trial datasets and reported as regulatory-directed summaries, limiting independent replication and prospective use for clinical simulation [5, 22]. The empirical observation that food delays but does not reduce LDX absorption — increasing Tmax by approximately 0.9 hours while leaving Cmax and AUC unchanged — has been well characterised [1, 3, 11], but the mechanistic basis for this delay (a reduction in the first-order gastric absorption rate constant ka) has not been formally incorporated into a publicly validated predictive model.</w:t>
       </w:r>
     </w:p>
     <w:p>
@@ -2283,7 +2283,7 @@
         </m:sSub>
       </m:oMath>
       <w:r>
-        <w:t xml:space="preserve">. All volumetric parameters were scaled linearly with body weight in kilograms. Simulations for paediatric datasets used the mean reported body weight of 34 kg (Boellner et al. 2010 [2]); adult simulations used 70 kg. Complete parameter values and their sources are provided in Table 1.</w:t>
+        <w:t xml:space="preserve">. All volumetric parameters were scaled linearly with body weight in kilograms [20, 21], a standard first approximation for the weight range represented in the validation datasets (34–70 kg). Simulations for paediatric datasets used the mean reported body weight of 34 kg (Boellner et al. 2010 [2]); adult simulations used 70 kg. Complete parameter values and their sources are provided in Table 1.</w:t>
       </w:r>
     </w:p>
     <w:p>
@@ -2291,7 +2291,7 @@
         <w:pStyle w:val="BodyText"/>
       </w:pPr>
       <w:r>
-        <w:t xml:space="preserve">The ODE system was integrated numerically using a fixed-step fourth-order Runge-Kutta (RK4) scheme with a time step of 0.01 h, implemented in Python within the dosetrack package. The integration was run from time 0 to 72 h for each simulation scenario. Cmax was defined as the maximum concentration in</w:t>
+        <w:t xml:space="preserve">The ODE system was integrated numerically using a fixed-step fourth-order Runge-Kutta (RK4) scheme with a time step of 0.01 h [18, 19], implemented in Python within the dosetrack package. The integration was run from time 0 to 72 h for each simulation scenario. Cmax was defined as the maximum concentration in</w:t>
       </w:r>
       <w:r>
         <w:t xml:space="preserve"> </w:t>
@@ -3677,7 +3677,10 @@
         </m:r>
       </m:oMath>
       <w:r>
-        <w:t xml:space="preserve">.</w:t>
+        <w:t xml:space="preserve"> </w:t>
+      </w:r>
+      <w:r>
+        <w:t xml:space="preserve">[26, 27]. Predictive accuracy was additionally characterised by MAPE as recommended for pharmacokinetic model evaluation [28, 29].</w:t>
       </w:r>
     </w:p>
     <w:p>
@@ -4633,7 +4636,7 @@
         <w:pStyle w:val="FirstParagraph"/>
       </w:pPr>
       <w:r>
-        <w:t xml:space="preserve">This study presents a mechanistic, parameter-fixed pharmacokinetic model for LDX that achieves Cmax MAPE of 9.1% and AUC MAPE of 10.9% across six independent dose-dataset combinations spanning a threefold weight range, a sevenfold dose range, and at least three distinct prandial conditions. To the authors’ knowledge, this is the first fully open, parameter-fixed predictive model for LDX PK to be validated against multiple independent published datasets and described in a peer-reviewed manuscript.</w:t>
+        <w:t xml:space="preserve">This study presents a mechanistic, parameter-fixed pharmacokinetic model for LDX that achieves Cmax MAPE of 9.1% and AUC MAPE of 45.9% across six independent dose-dataset combinations spanning a threefold weight range, a sevenfold dose range, and at least three distinct prandial conditions. To the authors’ knowledge, this is the first fully open, parameter-fixed predictive model for LDX PK to be validated against multiple independent published datasets and described in a peer-reviewed manuscript.</w:t>
       </w:r>
     </w:p>
     <w:p>
@@ -4687,7 +4690,7 @@
         <w:pStyle w:val="BodyText"/>
       </w:pPr>
       <w:r>
-        <w:t xml:space="preserve">The two-compartment architecture is standard for amphetamine-class compounds [5] and was chosen as the minimal structure capable of capturing the distribution phase that separates the Cmax peak from the terminal elimination phase. A one-compartment model would underestimate the breadth of the concentration peak and overestimate the early post-peak decline. The Michaelis-Menten kinetics for both conversion and elimination are mechanistically appropriate: LDX is converted by peptidases (principally in erythrocytes) with established saturable kinetics, and amphetamine is eliminated partly by renal excretion and partly by hepatic oxidation, both of which exhibit concentration-dependent rates at supratherapeutic concentrations [1, 5].</w:t>
+        <w:t xml:space="preserve">The two-compartment architecture is standard for amphetamine-class compounds [5, 12, 13] and was chosen as the minimal structure capable of capturing the distribution phase that separates the Cmax peak from the terminal elimination phase. A one-compartment model would underestimate the breadth of the concentration peak and overestimate the early post-peak decline. The Michaelis-Menten kinetics for both conversion and elimination are mechanistically appropriate: LDX is converted by peptidases (principally in erythrocytes) with established saturable kinetics, and amphetamine is eliminated partly by renal excretion and partly by hepatic oxidation, both of which exhibit concentration-dependent rates at supratherapeutic concentrations [1, 5].</w:t>
       </w:r>
     </w:p>
     <w:p>
@@ -4759,7 +4762,7 @@
         <w:t xml:space="preserve"> </w:t>
       </w:r>
       <w:r>
-        <w:t xml:space="preserve">values closer to the fasting reference than fasting adult subjects (0.72–0.76 versus 0.64–0.67 h⁻¹) is consistent with published physiological data on age-related differences in gastric emptying and luminal fat content [7]. This consistency lends biological credibility to the</w:t>
+        <w:t xml:space="preserve">values closer to the fasting reference than fasting adult subjects (0.72–0.76 versus 0.64–0.67 h⁻¹) is consistent with the known physiological differences in gastric emptying between children and adults. This consistency lends biological credibility to the</w:t>
       </w:r>
       <w:r>
         <w:t xml:space="preserve"> </w:t>
@@ -5577,7 +5580,7 @@
         </w:numPr>
       </w:pPr>
       <w:r>
-        <w:t xml:space="preserve">Dormuth CR, Maclure M, Bassett K, Jauca C, Whiteside C, Wright JM. Effect of periodic letters on evidence-based drug therapy for hypertension.</w:t>
+        <w:t xml:space="preserve">Polanczyk GV, Willcutt EG, Salum GA, Kieling C, Rohde LA. ADHD prevalence estimates across three decades: an updated systematic review and meta-regression analysis.</w:t>
       </w:r>
       <w:r>
         <w:t xml:space="preserve"> </w:t>
@@ -5587,10 +5590,538 @@
           <w:i/>
           <w:iCs/>
         </w:rPr>
-        <w:t xml:space="preserve">Pharmacoepidemiol Drug Saf</w:t>
-      </w:r>
-      <w:r>
-        <w:t xml:space="preserve">. 2004;13:S36.</w:t>
+        <w:t xml:space="preserve">Int J Epidemiol</w:t>
+      </w:r>
+      <w:r>
+        <w:t xml:space="preserve">. 2014;43(2):434–442.</w:t>
+      </w:r>
+    </w:p>
+    <w:p>
+      <w:pPr>
+        <w:numPr>
+          <w:ilvl w:val="0"/>
+          <w:numId w:val="1003"/>
+        </w:numPr>
+      </w:pPr>
+      <w:r>
+        <w:t xml:space="preserve">Cortese S, Adamo N, Del Giovane C, et al. Comparative efficacy and tolerability of medications for attention-deficit hyperactivity disorder in children, adolescents, and adults: a systematic review and network meta-analysis.</w:t>
+      </w:r>
+      <w:r>
+        <w:t xml:space="preserve"> </w:t>
+      </w:r>
+      <w:r>
+        <w:rPr>
+          <w:i/>
+          <w:iCs/>
+        </w:rPr>
+        <w:t xml:space="preserve">Lancet Psychiatry</w:t>
+      </w:r>
+      <w:r>
+        <w:t xml:space="preserve">. 2018;5(9):727–738.</w:t>
+      </w:r>
+    </w:p>
+    <w:p>
+      <w:pPr>
+        <w:numPr>
+          <w:ilvl w:val="0"/>
+          <w:numId w:val="1003"/>
+        </w:numPr>
+      </w:pPr>
+      <w:r>
+        <w:t xml:space="preserve">Rautio J, Kumpulainen H, Heimbach T, et al. Prodrugs: design and clinical applications.</w:t>
+      </w:r>
+      <w:r>
+        <w:t xml:space="preserve"> </w:t>
+      </w:r>
+      <w:r>
+        <w:rPr>
+          <w:i/>
+          <w:iCs/>
+        </w:rPr>
+        <w:t xml:space="preserve">Nat Rev Drug Discov</w:t>
+      </w:r>
+      <w:r>
+        <w:t xml:space="preserve">. 2008;7(3):255–270.</w:t>
+      </w:r>
+    </w:p>
+    <w:p>
+      <w:pPr>
+        <w:numPr>
+          <w:ilvl w:val="0"/>
+          <w:numId w:val="1003"/>
+        </w:numPr>
+      </w:pPr>
+      <w:r>
+        <w:t xml:space="preserve">Heal DJ, Smith SL, Gosden J, Nutt DJ. Amphetamine, past and present — a pharmacological and clinical perspective.</w:t>
+      </w:r>
+      <w:r>
+        <w:t xml:space="preserve"> </w:t>
+      </w:r>
+      <w:r>
+        <w:rPr>
+          <w:i/>
+          <w:iCs/>
+        </w:rPr>
+        <w:t xml:space="preserve">J Psychopharmacol</w:t>
+      </w:r>
+      <w:r>
+        <w:t xml:space="preserve">. 2013;27(6):479–496.</w:t>
+      </w:r>
+    </w:p>
+    <w:p>
+      <w:pPr>
+        <w:numPr>
+          <w:ilvl w:val="0"/>
+          <w:numId w:val="1003"/>
+        </w:numPr>
+      </w:pPr>
+      <w:r>
+        <w:t xml:space="preserve">Singh BN. Effects of food on clinical pharmacokinetics.</w:t>
+      </w:r>
+      <w:r>
+        <w:t xml:space="preserve"> </w:t>
+      </w:r>
+      <w:r>
+        <w:rPr>
+          <w:i/>
+          <w:iCs/>
+        </w:rPr>
+        <w:t xml:space="preserve">Clin Pharmacokinet</w:t>
+      </w:r>
+      <w:r>
+        <w:t xml:space="preserve">. 1999;37(3):213–255.</w:t>
+      </w:r>
+    </w:p>
+    <w:p>
+      <w:pPr>
+        <w:numPr>
+          <w:ilvl w:val="0"/>
+          <w:numId w:val="1003"/>
+        </w:numPr>
+      </w:pPr>
+      <w:r>
+        <w:t xml:space="preserve">Rowland M, Tozer TN.</w:t>
+      </w:r>
+      <w:r>
+        <w:t xml:space="preserve"> </w:t>
+      </w:r>
+      <w:r>
+        <w:rPr>
+          <w:i/>
+          <w:iCs/>
+        </w:rPr>
+        <w:t xml:space="preserve">Clinical Pharmacokinetics and Pharmacodynamics: Concepts and Applications</w:t>
+      </w:r>
+      <w:r>
+        <w:t xml:space="preserve">. 4th ed. Philadelphia: Lippincott Williams &amp; Wilkins; 2010.</w:t>
+      </w:r>
+    </w:p>
+    <w:p>
+      <w:pPr>
+        <w:numPr>
+          <w:ilvl w:val="0"/>
+          <w:numId w:val="1003"/>
+        </w:numPr>
+      </w:pPr>
+      <w:r>
+        <w:t xml:space="preserve">Gibaldi M, Perrier D.</w:t>
+      </w:r>
+      <w:r>
+        <w:t xml:space="preserve"> </w:t>
+      </w:r>
+      <w:r>
+        <w:rPr>
+          <w:i/>
+          <w:iCs/>
+        </w:rPr>
+        <w:t xml:space="preserve">Pharmacokinetics</w:t>
+      </w:r>
+      <w:r>
+        <w:t xml:space="preserve">. 2nd ed. New York: Marcel Dekker; 1982.</w:t>
+      </w:r>
+    </w:p>
+    <w:p>
+      <w:pPr>
+        <w:numPr>
+          <w:ilvl w:val="0"/>
+          <w:numId w:val="1003"/>
+        </w:numPr>
+      </w:pPr>
+      <w:r>
+        <w:t xml:space="preserve">Holford NHG, Sheiner LB. Understanding the dose-effect relationship: clinical application of pharmacokinetic-pharmacodynamic models.</w:t>
+      </w:r>
+      <w:r>
+        <w:t xml:space="preserve"> </w:t>
+      </w:r>
+      <w:r>
+        <w:rPr>
+          <w:i/>
+          <w:iCs/>
+        </w:rPr>
+        <w:t xml:space="preserve">Clin Pharmacokinet</w:t>
+      </w:r>
+      <w:r>
+        <w:t xml:space="preserve">. 1981;6(6):429–453.</w:t>
+      </w:r>
+    </w:p>
+    <w:p>
+      <w:pPr>
+        <w:numPr>
+          <w:ilvl w:val="0"/>
+          <w:numId w:val="1003"/>
+        </w:numPr>
+      </w:pPr>
+      <w:r>
+        <w:t xml:space="preserve">Bonate PL.</w:t>
+      </w:r>
+      <w:r>
+        <w:t xml:space="preserve"> </w:t>
+      </w:r>
+      <w:r>
+        <w:rPr>
+          <w:i/>
+          <w:iCs/>
+        </w:rPr>
+        <w:t xml:space="preserve">Pharmacokinetic-Pharmacodynamic Modeling and Simulation</w:t>
+      </w:r>
+      <w:r>
+        <w:t xml:space="preserve">. 2nd ed. New York: Springer; 2011.</w:t>
+      </w:r>
+    </w:p>
+    <w:p>
+      <w:pPr>
+        <w:numPr>
+          <w:ilvl w:val="0"/>
+          <w:numId w:val="1003"/>
+        </w:numPr>
+      </w:pPr>
+      <w:r>
+        <w:t xml:space="preserve">Meibohm B, Derendorf H. Basic concepts of pharmacokinetic/pharmacodynamic (PK/PD) modelling.</w:t>
+      </w:r>
+      <w:r>
+        <w:t xml:space="preserve"> </w:t>
+      </w:r>
+      <w:r>
+        <w:rPr>
+          <w:i/>
+          <w:iCs/>
+        </w:rPr>
+        <w:t xml:space="preserve">Int J Clin Pharmacol Ther</w:t>
+      </w:r>
+      <w:r>
+        <w:t xml:space="preserve">. 1997;35(10):401–413.</w:t>
+      </w:r>
+    </w:p>
+    <w:p>
+      <w:pPr>
+        <w:numPr>
+          <w:ilvl w:val="0"/>
+          <w:numId w:val="1003"/>
+        </w:numPr>
+      </w:pPr>
+      <w:r>
+        <w:t xml:space="preserve">Michaelis L, Menten ML. Die Kinetik der Invertinwirkung.</w:t>
+      </w:r>
+      <w:r>
+        <w:t xml:space="preserve"> </w:t>
+      </w:r>
+      <w:r>
+        <w:rPr>
+          <w:i/>
+          <w:iCs/>
+        </w:rPr>
+        <w:t xml:space="preserve">Biochem Z</w:t>
+      </w:r>
+      <w:r>
+        <w:t xml:space="preserve">. 1913;49:333–369.</w:t>
+      </w:r>
+    </w:p>
+    <w:p>
+      <w:pPr>
+        <w:numPr>
+          <w:ilvl w:val="0"/>
+          <w:numId w:val="1003"/>
+        </w:numPr>
+      </w:pPr>
+      <w:r>
+        <w:t xml:space="preserve">Press WH, Teukolsky SA, Vetterling WT, Flannery BP.</w:t>
+      </w:r>
+      <w:r>
+        <w:t xml:space="preserve"> </w:t>
+      </w:r>
+      <w:r>
+        <w:rPr>
+          <w:i/>
+          <w:iCs/>
+        </w:rPr>
+        <w:t xml:space="preserve">Numerical Recipes: The Art of Scientific Computing</w:t>
+      </w:r>
+      <w:r>
+        <w:t xml:space="preserve">. 3rd ed. Cambridge: Cambridge University Press; 2007.</w:t>
+      </w:r>
+    </w:p>
+    <w:p>
+      <w:pPr>
+        <w:numPr>
+          <w:ilvl w:val="0"/>
+          <w:numId w:val="1003"/>
+        </w:numPr>
+      </w:pPr>
+      <w:r>
+        <w:t xml:space="preserve">Butcher JC.</w:t>
+      </w:r>
+      <w:r>
+        <w:t xml:space="preserve"> </w:t>
+      </w:r>
+      <w:r>
+        <w:rPr>
+          <w:i/>
+          <w:iCs/>
+        </w:rPr>
+        <w:t xml:space="preserve">Numerical Methods for Ordinary Differential Equations</w:t>
+      </w:r>
+      <w:r>
+        <w:t xml:space="preserve">. 3rd ed. Chichester: Wiley; 2016.</w:t>
+      </w:r>
+    </w:p>
+    <w:p>
+      <w:pPr>
+        <w:numPr>
+          <w:ilvl w:val="0"/>
+          <w:numId w:val="1003"/>
+        </w:numPr>
+      </w:pPr>
+      <w:r>
+        <w:t xml:space="preserve">West GB, Brown JH, Enquist BJ. A general model for the origin of allometric scaling laws in biology.</w:t>
+      </w:r>
+      <w:r>
+        <w:t xml:space="preserve"> </w:t>
+      </w:r>
+      <w:r>
+        <w:rPr>
+          <w:i/>
+          <w:iCs/>
+        </w:rPr>
+        <w:t xml:space="preserve">Science</w:t>
+      </w:r>
+      <w:r>
+        <w:t xml:space="preserve">. 1997;276(5309):122–126.</w:t>
+      </w:r>
+    </w:p>
+    <w:p>
+      <w:pPr>
+        <w:numPr>
+          <w:ilvl w:val="0"/>
+          <w:numId w:val="1003"/>
+        </w:numPr>
+      </w:pPr>
+      <w:r>
+        <w:t xml:space="preserve">Mahmood I, Balian JD. The pharmacokinetic principles behind scaling from preclinical results to phase I protocols.</w:t>
+      </w:r>
+      <w:r>
+        <w:t xml:space="preserve"> </w:t>
+      </w:r>
+      <w:r>
+        <w:rPr>
+          <w:i/>
+          <w:iCs/>
+        </w:rPr>
+        <w:t xml:space="preserve">Xenobiotica</w:t>
+      </w:r>
+      <w:r>
+        <w:t xml:space="preserve">. 1999;29(6):559–574.</w:t>
+      </w:r>
+    </w:p>
+    <w:p>
+      <w:pPr>
+        <w:numPr>
+          <w:ilvl w:val="0"/>
+          <w:numId w:val="1003"/>
+        </w:numPr>
+      </w:pPr>
+      <w:r>
+        <w:t xml:space="preserve">Sheiner LB, Rosenberg B, Marathe VV. Estimation of population characteristics of pharmacokinetic parameters from routine clinical data.</w:t>
+      </w:r>
+      <w:r>
+        <w:t xml:space="preserve"> </w:t>
+      </w:r>
+      <w:r>
+        <w:rPr>
+          <w:i/>
+          <w:iCs/>
+        </w:rPr>
+        <w:t xml:space="preserve">J Pharmacokinet Biopharm</w:t>
+      </w:r>
+      <w:r>
+        <w:t xml:space="preserve">. 1977;5(5):445–479.</w:t>
+      </w:r>
+    </w:p>
+    <w:p>
+      <w:pPr>
+        <w:numPr>
+          <w:ilvl w:val="0"/>
+          <w:numId w:val="1003"/>
+        </w:numPr>
+      </w:pPr>
+      <w:r>
+        <w:t xml:space="preserve">Karlsson MO, Sheiner LB. The importance of modeling interoccasion variability in population pharmacokinetic analyses.</w:t>
+      </w:r>
+      <w:r>
+        <w:t xml:space="preserve"> </w:t>
+      </w:r>
+      <w:r>
+        <w:rPr>
+          <w:i/>
+          <w:iCs/>
+        </w:rPr>
+        <w:t xml:space="preserve">J Pharmacokinet Biopharm</w:t>
+      </w:r>
+      <w:r>
+        <w:t xml:space="preserve">. 1993;21(6):735–750.</w:t>
+      </w:r>
+    </w:p>
+    <w:p>
+      <w:pPr>
+        <w:numPr>
+          <w:ilvl w:val="0"/>
+          <w:numId w:val="1003"/>
+        </w:numPr>
+      </w:pPr>
+      <w:r>
+        <w:t xml:space="preserve">Anderson BJ, Holford NHG. Mechanism-based concepts of size and maturity in pharmacokinetics.</w:t>
+      </w:r>
+      <w:r>
+        <w:t xml:space="preserve"> </w:t>
+      </w:r>
+      <w:r>
+        <w:rPr>
+          <w:i/>
+          <w:iCs/>
+        </w:rPr>
+        <w:t xml:space="preserve">Annu Rev Pharmacol Toxicol</w:t>
+      </w:r>
+      <w:r>
+        <w:t xml:space="preserve">. 2008;48:303–332.</w:t>
+      </w:r>
+    </w:p>
+    <w:p>
+      <w:pPr>
+        <w:numPr>
+          <w:ilvl w:val="0"/>
+          <w:numId w:val="1003"/>
+        </w:numPr>
+      </w:pPr>
+      <w:r>
+        <w:t xml:space="preserve">Bergstrand M, Hooker AC, Wallin JE, Karlsson MO. Prediction-corrected visual predictive checks for diagnosing nonlinear mixed-effects models.</w:t>
+      </w:r>
+      <w:r>
+        <w:t xml:space="preserve"> </w:t>
+      </w:r>
+      <w:r>
+        <w:rPr>
+          <w:i/>
+          <w:iCs/>
+        </w:rPr>
+        <w:t xml:space="preserve">AAPS J</w:t>
+      </w:r>
+      <w:r>
+        <w:t xml:space="preserve">. 2011;13(2):143–151.</w:t>
+      </w:r>
+    </w:p>
+    <w:p>
+      <w:pPr>
+        <w:numPr>
+          <w:ilvl w:val="0"/>
+          <w:numId w:val="1003"/>
+        </w:numPr>
+      </w:pPr>
+      <w:r>
+        <w:t xml:space="preserve">Akaike H. A new look at the statistical model identification.</w:t>
+      </w:r>
+      <w:r>
+        <w:t xml:space="preserve"> </w:t>
+      </w:r>
+      <w:r>
+        <w:rPr>
+          <w:i/>
+          <w:iCs/>
+        </w:rPr>
+        <w:t xml:space="preserve">IEEE Trans Autom Control</w:t>
+      </w:r>
+      <w:r>
+        <w:t xml:space="preserve">. 1974;19(6):716–723.</w:t>
+      </w:r>
+    </w:p>
+    <w:p>
+      <w:pPr>
+        <w:numPr>
+          <w:ilvl w:val="0"/>
+          <w:numId w:val="1003"/>
+        </w:numPr>
+      </w:pPr>
+      <w:r>
+        <w:t xml:space="preserve">Burnham KP, Anderson DR.</w:t>
+      </w:r>
+      <w:r>
+        <w:t xml:space="preserve"> </w:t>
+      </w:r>
+      <w:r>
+        <w:rPr>
+          <w:i/>
+          <w:iCs/>
+        </w:rPr>
+        <w:t xml:space="preserve">Model Selection and Multimodel Inference: A Practical Information-Theoretic Approach</w:t>
+      </w:r>
+      <w:r>
+        <w:t xml:space="preserve">. 2nd ed. New York: Springer; 2002.</w:t>
+      </w:r>
+    </w:p>
+    <w:p>
+      <w:pPr>
+        <w:numPr>
+          <w:ilvl w:val="0"/>
+          <w:numId w:val="1003"/>
+        </w:numPr>
+      </w:pPr>
+      <w:r>
+        <w:t xml:space="preserve">Hyndman RJ, Koehler AB. Another look at measures of forecast accuracy.</w:t>
+      </w:r>
+      <w:r>
+        <w:t xml:space="preserve"> </w:t>
+      </w:r>
+      <w:r>
+        <w:rPr>
+          <w:i/>
+          <w:iCs/>
+        </w:rPr>
+        <w:t xml:space="preserve">Int J Forecast</w:t>
+      </w:r>
+      <w:r>
+        <w:t xml:space="preserve">. 2006;22(4):679–688.</w:t>
+      </w:r>
+    </w:p>
+    <w:p>
+      <w:pPr>
+        <w:numPr>
+          <w:ilvl w:val="0"/>
+          <w:numId w:val="1003"/>
+        </w:numPr>
+      </w:pPr>
+      <w:r>
+        <w:t xml:space="preserve">Sheiner LB, Beal SL. Some suggestions for measuring predictive performance.</w:t>
+      </w:r>
+      <w:r>
+        <w:t xml:space="preserve"> </w:t>
+      </w:r>
+      <w:r>
+        <w:rPr>
+          <w:i/>
+          <w:iCs/>
+        </w:rPr>
+        <w:t xml:space="preserve">J Pharmacokinet Biopharm</w:t>
+      </w:r>
+      <w:r>
+        <w:t xml:space="preserve">. 1981;9(4):503–512.</w:t>
       </w:r>
     </w:p>
     <w:p>

</xml_diff>

<commit_message>
Add Code Availability section, Figure 2 food effect, figure legends
- Code Availability: git commit hash, Python 3.12.4, dependencies
- Figure 2: two-panel food effect back-calculation (ka→Tmax + per-cohort ka bars)
- Figure legends for Figure 1 and Figure 2
- Fixed duplicate --- separator in manuscript
</commit_message>
<xml_diff>
--- a/manuscript.docx
+++ b/manuscript.docx
@@ -2,7 +2,7 @@
 <file path=word/document.xml><?xml version="1.0" encoding="utf-8"?>
 <w:document xmlns:w="http://schemas.openxmlformats.org/wordprocessingml/2006/main" xmlns:m="http://schemas.openxmlformats.org/officeDocument/2006/math" xmlns:r="http://schemas.openxmlformats.org/officeDocument/2006/relationships" xmlns:o="urn:schemas-microsoft-com:office:office" xmlns:v="urn:schemas-microsoft-com:vml" xmlns:w10="urn:schemas-microsoft-com:office:word" xmlns:a="http://schemas.openxmlformats.org/drawingml/2006/main" xmlns:pic="http://schemas.openxmlformats.org/drawingml/2006/picture" xmlns:wp="http://schemas.openxmlformats.org/drawingml/2006/wordprocessingDrawing">
   <w:body>
-    <w:bookmarkStart w:id="30" w:name="Xd444c72cbf5f9775fd8715fc0d99d74d9ac0e9e"/>
+    <w:bookmarkStart w:id="32" w:name="Xd444c72cbf5f9775fd8715fc0d99d74d9ac0e9e"/>
     <w:p>
       <w:pPr>
         <w:pStyle w:val="Heading1"/>
@@ -10126,6 +10126,119 @@
       </w:r>
     </w:p>
     <w:p>
+      <w:r>
+        <w:pict>
+          <v:rect style="width:0;height:1.5pt" o:hralign="center" o:hrstd="t" o:hr="t"/>
+        </w:pict>
+      </w:r>
+    </w:p>
+    <w:bookmarkEnd w:id="28"/>
+    <w:bookmarkEnd w:id="29"/>
+    <w:bookmarkStart w:id="30" w:name="code-and-data-availability"/>
+    <w:p>
+      <w:pPr>
+        <w:pStyle w:val="Heading2"/>
+      </w:pPr>
+      <w:r>
+        <w:t xml:space="preserve">Code and Data Availability</w:t>
+      </w:r>
+    </w:p>
+    <w:p>
+      <w:pPr>
+        <w:pStyle w:val="FirstParagraph"/>
+      </w:pPr>
+      <w:r>
+        <w:t xml:space="preserve">The complete source code for the dosetrack package, simulation engine, validation scripts, and bootstrap analysis is publicly available at https://github.com/abinittio/dosetrack-v4 under the MIT licence (commit</w:t>
+      </w:r>
+      <w:r>
+        <w:t xml:space="preserve"> </w:t>
+      </w:r>
+      <w:r>
+        <w:rPr>
+          <w:rStyle w:val="VerbatimChar"/>
+        </w:rPr>
+        <w:t xml:space="preserve">f021f52</w:t>
+      </w:r>
+      <w:r>
+        <w:t xml:space="preserve">). The interactive simulation tool is deployed at https://dosetrack.dis-solved.com. All validation datasets used in this study were extracted from previously published manuscripts cited in the References; no primary data were generated. The computational environment used for all analyses was Python 3.12.4 with NumPy ≥1.24, SciPy, and Matplotlib ≥3.7. Full dependency specifications are provided in</w:t>
+      </w:r>
+      <w:r>
+        <w:t xml:space="preserve"> </w:t>
+      </w:r>
+      <w:r>
+        <w:rPr>
+          <w:rStyle w:val="VerbatimChar"/>
+        </w:rPr>
+        <w:t xml:space="preserve">requirements.txt</w:t>
+      </w:r>
+      <w:r>
+        <w:t xml:space="preserve"> </w:t>
+      </w:r>
+      <w:r>
+        <w:t xml:space="preserve">in the repository.</w:t>
+      </w:r>
+    </w:p>
+    <w:p>
+      <w:r>
+        <w:pict>
+          <v:rect style="width:0;height:1.5pt" o:hralign="center" o:hrstd="t" o:hr="t"/>
+        </w:pict>
+      </w:r>
+    </w:p>
+    <w:bookmarkEnd w:id="30"/>
+    <w:bookmarkStart w:id="31" w:name="figure-legends"/>
+    <w:p>
+      <w:pPr>
+        <w:pStyle w:val="Heading2"/>
+      </w:pPr>
+      <w:r>
+        <w:t xml:space="preserve">Figure Legends</w:t>
+      </w:r>
+    </w:p>
+    <w:p>
+      <w:pPr>
+        <w:pStyle w:val="FirstParagraph"/>
+      </w:pPr>
+      <w:r>
+        <w:rPr>
+          <w:b/>
+          <w:bCs/>
+        </w:rPr>
+        <w:t xml:space="preserve">Figure 1.</w:t>
+      </w:r>
+      <w:r>
+        <w:t xml:space="preserve"> </w:t>
+      </w:r>
+      <w:r>
+        <w:t xml:space="preserve">Simulated d-amphetamine plasma concentration–time profiles (prodrug 2-compartment MM model) for six validation scenarios. Solid circles denote published mean Cmax values; error bars denote ±1 SD (or 95% CI for Dolder 2017). Tmax values are marked by vertical dashed lines. All simulations used fasting ka = 0.85 h⁻¹.</w:t>
+      </w:r>
+    </w:p>
+    <w:p>
+      <w:pPr>
+        <w:pStyle w:val="BodyText"/>
+      </w:pPr>
+      <w:r>
+        <w:rPr>
+          <w:b/>
+          <w:bCs/>
+        </w:rPr>
+        <w:t xml:space="preserve">Figure 2.</w:t>
+      </w:r>
+      <w:r>
+        <w:t xml:space="preserve"> </w:t>
+      </w:r>
+      <w:r>
+        <w:t xml:space="preserve">First-principles food effect back-calculation. Panel A: analytical Tmax as a function of absorption rate constant ka (solid curve), with fasting and fed reference values shown as vertical dashed lines. Coloured points indicate the back-calculated ka for each study cohort. Panel B: bar chart of back-calculated ka values per cohort with implied % fed equivalent. Blue = fasting protocol; amber = pooled/mixed protocol; green = standardised meal. The rank ordering from highest (most fasted) to lowest (most fed) ka is fully consistent with each study’s published prandial protocol.</w:t>
+      </w:r>
+    </w:p>
+    <w:p>
+      <w:r>
+        <w:pict>
+          <v:rect style="width:0;height:1.5pt" o:hralign="center" o:hrstd="t" o:hr="t"/>
+        </w:pict>
+      </w:r>
+    </w:p>
+    <w:p>
       <w:pPr>
         <w:pStyle w:val="FirstParagraph"/>
       </w:pPr>
@@ -10134,29 +10247,7 @@
           <w:i/>
           <w:iCs/>
         </w:rPr>
-        <w:t xml:space="preserve">Manuscript word count (excluding tables and references): approximately 3,500 words.</w:t>
-      </w:r>
-    </w:p>
-    <w:p>
-      <w:pPr>
-        <w:pStyle w:val="BodyText"/>
-      </w:pPr>
-      <w:r>
-        <w:rPr>
-          <w:i/>
-          <w:iCs/>
-        </w:rPr>
-        <w:t xml:space="preserve">Open-source code: https://github.com/abinittio/dosetrack-v4 (MIT licence)</w:t>
-      </w:r>
-      <w:r>
-        <w:t xml:space="preserve"> </w:t>
-      </w:r>
-      <w:r>
-        <w:rPr>
-          <w:i/>
-          <w:iCs/>
-        </w:rPr>
-        <w:t xml:space="preserve">Interactive simulation tool: https://dosetrack.dis-solved.com</w:t>
+        <w:t xml:space="preserve">Manuscript word count (excluding tables, references, and figure legends): approximately 3,600 words.</w:t>
       </w:r>
     </w:p>
     <w:p>
@@ -10171,9 +10262,8 @@
         <w:t xml:space="preserve">The authors declare no conflicts of interest. No funding was received for this work.</w:t>
       </w:r>
     </w:p>
-    <w:bookmarkEnd w:id="28"/>
-    <w:bookmarkEnd w:id="29"/>
-    <w:bookmarkEnd w:id="30"/>
+    <w:bookmarkEnd w:id="31"/>
+    <w:bookmarkEnd w:id="32"/>
     <w:sectPr>
       <w:footnotePr>
         <w:numRestart w:val="eachSect"/>

</xml_diff>